<commit_message>
Apply Table 1 & Table 3 fixes to tofu LCA ver3 docx
- Table 1: reclassify Wastewater and Whey rows from 'Output material'
  into a new 'Emission to water' category group (values unchanged).
- Table 3: fill the per-stage 'Share (%)' column
  (Boiling 51.7, Grinding 17.8, Soaking 11.1, Coagulation 6.7,
   Washing 11.5, Molding and Packing 1.3; Total 100).
- Update review note with applied-fixes addendum.

Document integrity, embedded figure, and all five tables verified intact.
</commit_message>
<xml_diff>
--- a/research-map/perbandingan/Alifa Paper Tofu Production ver3.docx
+++ b/research-map/perbandingan/Alifa Paper Tofu Production ver3.docx
@@ -2953,7 +2953,7 @@
                 <w:sz w:val="20"/>
                 <w:szCs w:val="20"/>
               </w:rPr>
-              <w:t>Wastewater</w:t>
+              <w:t>Okara</w:t>
             </w:r>
           </w:p>
         </w:tc>
@@ -2980,7 +2980,7 @@
                 <w:sz w:val="20"/>
                 <w:szCs w:val="20"/>
               </w:rPr>
-              <w:t>L</w:t>
+              <w:t>kg</w:t>
             </w:r>
           </w:p>
         </w:tc>
@@ -3007,7 +3007,7 @@
                 <w:sz w:val="20"/>
                 <w:szCs w:val="20"/>
               </w:rPr>
-              <w:t>2660</w:t>
+              <w:t>-</w:t>
             </w:r>
           </w:p>
         </w:tc>
@@ -3034,7 +3034,7 @@
                 <w:sz w:val="20"/>
                 <w:szCs w:val="20"/>
               </w:rPr>
-              <w:t>600</w:t>
+              <w:t>-</w:t>
             </w:r>
           </w:p>
         </w:tc>
@@ -3115,7 +3115,7 @@
                 <w:sz w:val="20"/>
                 <w:szCs w:val="20"/>
               </w:rPr>
-              <w:t>-</w:t>
+              <w:t>1600</w:t>
             </w:r>
           </w:p>
         </w:tc>
@@ -3169,7 +3169,7 @@
                 <w:sz w:val="20"/>
                 <w:szCs w:val="20"/>
               </w:rPr>
-              <w:t>100</w:t>
+              <w:t>-</w:t>
             </w:r>
           </w:p>
         </w:tc>
@@ -3208,12 +3208,11 @@
             </w:pPr>
             <w:r>
               <w:rPr>
-                <w:rFonts w:ascii="Cambria" w:hAnsi="Cambria" w:cs="Times New Roman"/>
-                <w:sz w:val="20"/>
-                <w:szCs w:val="20"/>
-                <w:lang w:eastAsia="en-ID"/>
-              </w:rPr>
-              <w:t>Whey</w:t>
+                <w:rFonts w:ascii="Cambria" w:hAnsi="Cambria"/>
+                <w:sz w:val="20"/>
+                <w:szCs w:val="20"/>
+              </w:rPr>
+              <w:t>Steam loss</w:t>
             </w:r>
           </w:p>
         </w:tc>
@@ -3348,7 +3347,7 @@
                 <w:sz w:val="20"/>
                 <w:szCs w:val="20"/>
               </w:rPr>
-              <w:t>-</w:t>
+              <w:t>588</w:t>
             </w:r>
           </w:p>
         </w:tc>
@@ -3402,7 +3401,7 @@
                 <w:sz w:val="20"/>
                 <w:szCs w:val="20"/>
               </w:rPr>
-              <w:t>10434</w:t>
+              <w:t>-</w:t>
             </w:r>
           </w:p>
         </w:tc>
@@ -3439,15 +3438,908 @@
           <w:tcPr>
             <w:tcW w:w="456" w:type="pct"/>
             <w:vMerge/>
-          </w:tcPr>
-          <w:p>
-            <w:pPr>
-              <w:rPr>
-                <w:rFonts w:ascii="Cambria" w:hAnsi="Cambria"/>
-                <w:sz w:val="20"/>
-                <w:szCs w:val="20"/>
-              </w:rPr>
-            </w:pPr>
+            <w:tcBorders>
+              <w:bottom w:val="single" w:sz="4" w:space="0" w:color="auto"/>
+            </w:tcBorders>
+          </w:tcPr>
+          <w:p>
+            <w:pPr>
+              <w:rPr>
+                <w:rFonts w:ascii="Cambria" w:hAnsi="Cambria"/>
+                <w:sz w:val="20"/>
+                <w:szCs w:val="20"/>
+              </w:rPr>
+            </w:pPr>
+          </w:p>
+        </w:tc>
+        <w:tc>
+          <w:tcPr>
+            <w:tcW w:w="710" w:type="pct"/>
+            <w:tcBorders>
+              <w:top w:val="nil"/>
+              <w:bottom w:val="single" w:sz="4" w:space="0" w:color="auto"/>
+            </w:tcBorders>
+          </w:tcPr>
+          <w:p>
+            <w:pPr>
+              <w:rPr>
+                <w:rFonts w:ascii="Cambria" w:hAnsi="Cambria"/>
+                <w:sz w:val="20"/>
+                <w:szCs w:val="20"/>
+              </w:rPr>
+            </w:pPr>
+            <w:r>
+              <w:rPr>
+                <w:rFonts w:ascii="Cambria" w:hAnsi="Cambria"/>
+                <w:sz w:val="20"/>
+                <w:szCs w:val="20"/>
+              </w:rPr>
+              <w:t>Wood ashes</w:t>
+            </w:r>
+          </w:p>
+        </w:tc>
+        <w:tc>
+          <w:tcPr>
+            <w:tcW w:w="289" w:type="pct"/>
+            <w:tcBorders>
+              <w:top w:val="nil"/>
+              <w:bottom w:val="single" w:sz="4" w:space="0" w:color="auto"/>
+            </w:tcBorders>
+          </w:tcPr>
+          <w:p>
+            <w:pPr>
+              <w:jc w:val="center"/>
+              <w:rPr>
+                <w:rFonts w:ascii="Cambria" w:hAnsi="Cambria"/>
+                <w:sz w:val="20"/>
+                <w:szCs w:val="20"/>
+              </w:rPr>
+            </w:pPr>
+            <w:r>
+              <w:rPr>
+                <w:rFonts w:ascii="Cambria" w:hAnsi="Cambria"/>
+                <w:sz w:val="20"/>
+                <w:szCs w:val="20"/>
+              </w:rPr>
+              <w:t>kg</w:t>
+            </w:r>
+          </w:p>
+        </w:tc>
+        <w:tc>
+          <w:tcPr>
+            <w:tcW w:w="633" w:type="pct"/>
+            <w:tcBorders>
+              <w:top w:val="nil"/>
+              <w:bottom w:val="single" w:sz="4" w:space="0" w:color="auto"/>
+            </w:tcBorders>
+          </w:tcPr>
+          <w:p>
+            <w:pPr>
+              <w:jc w:val="center"/>
+              <w:rPr>
+                <w:rFonts w:ascii="Cambria" w:hAnsi="Cambria"/>
+                <w:sz w:val="20"/>
+                <w:szCs w:val="20"/>
+              </w:rPr>
+            </w:pPr>
+          </w:p>
+        </w:tc>
+        <w:tc>
+          <w:tcPr>
+            <w:tcW w:w="370" w:type="pct"/>
+            <w:tcBorders>
+              <w:top w:val="nil"/>
+              <w:bottom w:val="single" w:sz="4" w:space="0" w:color="auto"/>
+            </w:tcBorders>
+          </w:tcPr>
+          <w:p>
+            <w:pPr>
+              <w:jc w:val="center"/>
+              <w:rPr>
+                <w:rFonts w:ascii="Cambria" w:hAnsi="Cambria"/>
+                <w:sz w:val="20"/>
+                <w:szCs w:val="20"/>
+              </w:rPr>
+            </w:pPr>
+          </w:p>
+        </w:tc>
+        <w:tc>
+          <w:tcPr>
+            <w:tcW w:w="505" w:type="pct"/>
+            <w:tcBorders>
+              <w:top w:val="nil"/>
+              <w:bottom w:val="single" w:sz="4" w:space="0" w:color="auto"/>
+            </w:tcBorders>
+          </w:tcPr>
+          <w:p>
+            <w:pPr>
+              <w:jc w:val="center"/>
+              <w:rPr>
+                <w:rFonts w:ascii="Cambria" w:hAnsi="Cambria"/>
+                <w:sz w:val="20"/>
+                <w:szCs w:val="20"/>
+              </w:rPr>
+            </w:pPr>
+          </w:p>
+        </w:tc>
+        <w:tc>
+          <w:tcPr>
+            <w:tcW w:w="501" w:type="pct"/>
+            <w:tcBorders>
+              <w:top w:val="nil"/>
+              <w:bottom w:val="single" w:sz="4" w:space="0" w:color="auto"/>
+            </w:tcBorders>
+          </w:tcPr>
+          <w:p>
+            <w:pPr>
+              <w:jc w:val="center"/>
+              <w:rPr>
+                <w:rFonts w:ascii="Cambria" w:hAnsi="Cambria"/>
+                <w:sz w:val="20"/>
+                <w:szCs w:val="20"/>
+              </w:rPr>
+            </w:pPr>
+            <w:r>
+              <w:rPr>
+                <w:rFonts w:ascii="Cambria" w:hAnsi="Cambria"/>
+                <w:sz w:val="20"/>
+                <w:szCs w:val="20"/>
+              </w:rPr>
+              <w:t>16</w:t>
+            </w:r>
+          </w:p>
+        </w:tc>
+        <w:tc>
+          <w:tcPr>
+            <w:tcW w:w="508" w:type="pct"/>
+            <w:tcBorders>
+              <w:top w:val="nil"/>
+              <w:bottom w:val="single" w:sz="4" w:space="0" w:color="auto"/>
+            </w:tcBorders>
+          </w:tcPr>
+          <w:p>
+            <w:pPr>
+              <w:jc w:val="center"/>
+              <w:rPr>
+                <w:rFonts w:ascii="Cambria" w:hAnsi="Cambria"/>
+                <w:sz w:val="20"/>
+                <w:szCs w:val="20"/>
+              </w:rPr>
+            </w:pPr>
+          </w:p>
+        </w:tc>
+        <w:tc>
+          <w:tcPr>
+            <w:tcW w:w="521" w:type="pct"/>
+            <w:tcBorders>
+              <w:top w:val="nil"/>
+              <w:bottom w:val="single" w:sz="4" w:space="0" w:color="auto"/>
+            </w:tcBorders>
+          </w:tcPr>
+          <w:p>
+            <w:pPr>
+              <w:jc w:val="center"/>
+              <w:rPr>
+                <w:rFonts w:ascii="Cambria" w:hAnsi="Cambria"/>
+                <w:sz w:val="20"/>
+                <w:szCs w:val="20"/>
+              </w:rPr>
+            </w:pPr>
+          </w:p>
+        </w:tc>
+        <w:tc>
+          <w:tcPr>
+            <w:tcW w:w="507" w:type="pct"/>
+            <w:tcBorders>
+              <w:top w:val="nil"/>
+              <w:bottom w:val="single" w:sz="4" w:space="0" w:color="auto"/>
+            </w:tcBorders>
+          </w:tcPr>
+          <w:p>
+            <w:pPr>
+              <w:jc w:val="center"/>
+              <w:rPr>
+                <w:rFonts w:ascii="Cambria" w:hAnsi="Cambria"/>
+                <w:sz w:val="20"/>
+                <w:szCs w:val="20"/>
+              </w:rPr>
+            </w:pPr>
+          </w:p>
+        </w:tc>
+      </w:tr>
+      <w:tr>
+        <w:tc>
+          <w:tcPr>
+            <w:tcW w:w="456" w:type="pct"/>
+            <w:vMerge w:val="restart"/>
+          </w:tcPr>
+          <w:p>
+            <w:pPr>
+              <w:rPr>
+                <w:rFonts w:ascii="Cambria" w:hAnsi="Cambria"/>
+                <w:sz w:val="20"/>
+                <w:szCs w:val="20"/>
+              </w:rPr>
+            </w:pPr>
+            <w:r>
+              <w:rPr>
+                <w:rFonts w:ascii="Cambria" w:hAnsi="Cambria"/>
+                <w:sz w:val="20"/>
+                <w:szCs w:val="20"/>
+              </w:rPr>
+              <w:t>Emission</w:t>
+            </w:r>
+          </w:p>
+        </w:tc>
+        <w:tc>
+          <w:tcPr>
+            <w:tcW w:w="710" w:type="pct"/>
+            <w:vAlign w:val="center"/>
+          </w:tcPr>
+          <w:p>
+            <w:pPr>
+              <w:rPr>
+                <w:rFonts w:ascii="Cambria" w:hAnsi="Cambria"/>
+                <w:sz w:val="20"/>
+                <w:szCs w:val="20"/>
+              </w:rPr>
+            </w:pPr>
+            <w:r>
+              <w:rPr>
+                <w:rFonts w:ascii="Cambria" w:hAnsi="Cambria" w:cs="Times New Roman"/>
+                <w:sz w:val="20"/>
+                <w:szCs w:val="20"/>
+                <w:lang w:eastAsia="en-ID"/>
+              </w:rPr>
+              <w:t>CO₂</w:t>
+            </w:r>
+          </w:p>
+        </w:tc>
+        <w:tc>
+          <w:tcPr>
+            <w:tcW w:w="289" w:type="pct"/>
+          </w:tcPr>
+          <w:p>
+            <w:pPr>
+              <w:jc w:val="center"/>
+              <w:rPr>
+                <w:rFonts w:ascii="Cambria" w:hAnsi="Cambria"/>
+                <w:sz w:val="20"/>
+                <w:szCs w:val="20"/>
+              </w:rPr>
+            </w:pPr>
+            <w:r>
+              <w:rPr>
+                <w:rFonts w:ascii="Cambria" w:hAnsi="Cambria"/>
+                <w:sz w:val="20"/>
+                <w:szCs w:val="20"/>
+              </w:rPr>
+              <w:t>kg</w:t>
+            </w:r>
+          </w:p>
+        </w:tc>
+        <w:tc>
+          <w:tcPr>
+            <w:tcW w:w="633" w:type="pct"/>
+          </w:tcPr>
+          <w:p>
+            <w:pPr>
+              <w:jc w:val="center"/>
+              <w:rPr>
+                <w:rFonts w:ascii="Cambria" w:hAnsi="Cambria"/>
+                <w:sz w:val="20"/>
+                <w:szCs w:val="20"/>
+              </w:rPr>
+            </w:pPr>
+            <w:r>
+              <w:rPr>
+                <w:rFonts w:ascii="Cambria" w:hAnsi="Cambria"/>
+                <w:sz w:val="20"/>
+                <w:szCs w:val="20"/>
+              </w:rPr>
+              <w:t>0.51</w:t>
+            </w:r>
+          </w:p>
+        </w:tc>
+        <w:tc>
+          <w:tcPr>
+            <w:tcW w:w="370" w:type="pct"/>
+          </w:tcPr>
+          <w:p>
+            <w:pPr>
+              <w:jc w:val="center"/>
+              <w:rPr>
+                <w:rFonts w:ascii="Cambria" w:hAnsi="Cambria"/>
+                <w:sz w:val="20"/>
+                <w:szCs w:val="20"/>
+              </w:rPr>
+            </w:pPr>
+            <w:r>
+              <w:rPr>
+                <w:rFonts w:ascii="Cambria" w:hAnsi="Cambria"/>
+                <w:sz w:val="20"/>
+                <w:szCs w:val="20"/>
+              </w:rPr>
+              <w:t>0.38</w:t>
+            </w:r>
+          </w:p>
+        </w:tc>
+        <w:tc>
+          <w:tcPr>
+            <w:tcW w:w="505" w:type="pct"/>
+          </w:tcPr>
+          <w:p>
+            <w:pPr>
+              <w:jc w:val="center"/>
+              <w:rPr>
+                <w:rFonts w:ascii="Cambria" w:hAnsi="Cambria"/>
+                <w:sz w:val="20"/>
+                <w:szCs w:val="20"/>
+              </w:rPr>
+            </w:pPr>
+            <w:r>
+              <w:rPr>
+                <w:rFonts w:ascii="Cambria" w:hAnsi="Cambria"/>
+                <w:sz w:val="20"/>
+                <w:szCs w:val="20"/>
+              </w:rPr>
+              <w:t>14.45</w:t>
+            </w:r>
+          </w:p>
+        </w:tc>
+        <w:tc>
+          <w:tcPr>
+            <w:tcW w:w="501" w:type="pct"/>
+          </w:tcPr>
+          <w:p>
+            <w:pPr>
+              <w:jc w:val="center"/>
+              <w:rPr>
+                <w:rFonts w:ascii="Cambria" w:hAnsi="Cambria"/>
+                <w:sz w:val="20"/>
+                <w:szCs w:val="20"/>
+              </w:rPr>
+            </w:pPr>
+            <w:r>
+              <w:rPr>
+                <w:rFonts w:ascii="Cambria" w:hAnsi="Cambria"/>
+                <w:sz w:val="20"/>
+                <w:szCs w:val="20"/>
+              </w:rPr>
+              <w:t>1397</w:t>
+            </w:r>
+          </w:p>
+        </w:tc>
+        <w:tc>
+          <w:tcPr>
+            <w:tcW w:w="508" w:type="pct"/>
+          </w:tcPr>
+          <w:p>
+            <w:pPr>
+              <w:jc w:val="center"/>
+              <w:rPr>
+                <w:rFonts w:ascii="Cambria" w:hAnsi="Cambria"/>
+                <w:sz w:val="20"/>
+                <w:szCs w:val="20"/>
+              </w:rPr>
+            </w:pPr>
+            <w:r>
+              <w:rPr>
+                <w:rFonts w:ascii="Cambria" w:hAnsi="Cambria"/>
+                <w:sz w:val="20"/>
+                <w:szCs w:val="20"/>
+              </w:rPr>
+              <w:t>-</w:t>
+            </w:r>
+          </w:p>
+        </w:tc>
+        <w:tc>
+          <w:tcPr>
+            <w:tcW w:w="521" w:type="pct"/>
+          </w:tcPr>
+          <w:p>
+            <w:pPr>
+              <w:jc w:val="center"/>
+              <w:rPr>
+                <w:rFonts w:ascii="Cambria" w:hAnsi="Cambria"/>
+                <w:sz w:val="20"/>
+                <w:szCs w:val="20"/>
+              </w:rPr>
+            </w:pPr>
+            <w:r>
+              <w:rPr>
+                <w:rFonts w:ascii="Cambria" w:hAnsi="Cambria"/>
+                <w:sz w:val="20"/>
+                <w:szCs w:val="20"/>
+              </w:rPr>
+              <w:t>-</w:t>
+            </w:r>
+          </w:p>
+        </w:tc>
+        <w:tc>
+          <w:tcPr>
+            <w:tcW w:w="507" w:type="pct"/>
+          </w:tcPr>
+          <w:p>
+            <w:pPr>
+              <w:jc w:val="center"/>
+              <w:rPr>
+                <w:rFonts w:ascii="Cambria" w:hAnsi="Cambria"/>
+                <w:sz w:val="20"/>
+                <w:szCs w:val="20"/>
+              </w:rPr>
+            </w:pPr>
+            <w:r>
+              <w:rPr>
+                <w:rFonts w:ascii="Cambria" w:hAnsi="Cambria"/>
+                <w:sz w:val="20"/>
+                <w:szCs w:val="20"/>
+              </w:rPr>
+              <w:t>-</w:t>
+            </w:r>
+          </w:p>
+        </w:tc>
+      </w:tr>
+      <w:tr>
+        <w:tc>
+          <w:tcPr>
+            <w:tcW w:w="456" w:type="pct"/>
+            <w:vMerge/>
+          </w:tcPr>
+          <w:p>
+            <w:pPr>
+              <w:rPr>
+                <w:rFonts w:ascii="Cambria" w:hAnsi="Cambria"/>
+                <w:sz w:val="20"/>
+                <w:szCs w:val="20"/>
+              </w:rPr>
+            </w:pPr>
+          </w:p>
+        </w:tc>
+        <w:tc>
+          <w:tcPr>
+            <w:tcW w:w="710" w:type="pct"/>
+            <w:vAlign w:val="center"/>
+          </w:tcPr>
+          <w:p>
+            <w:pPr>
+              <w:rPr>
+                <w:rFonts w:ascii="Cambria" w:hAnsi="Cambria"/>
+                <w:sz w:val="20"/>
+                <w:szCs w:val="20"/>
+              </w:rPr>
+            </w:pPr>
+            <w:r>
+              <w:rPr>
+                <w:rFonts w:ascii="Cambria" w:hAnsi="Cambria" w:cs="Times New Roman"/>
+                <w:sz w:val="20"/>
+                <w:szCs w:val="20"/>
+                <w:lang w:eastAsia="en-ID"/>
+              </w:rPr>
+              <w:t xml:space="preserve">CH₄ </w:t>
+            </w:r>
+          </w:p>
+        </w:tc>
+        <w:tc>
+          <w:tcPr>
+            <w:tcW w:w="289" w:type="pct"/>
+          </w:tcPr>
+          <w:p>
+            <w:pPr>
+              <w:jc w:val="center"/>
+              <w:rPr>
+                <w:rFonts w:ascii="Cambria" w:hAnsi="Cambria"/>
+                <w:sz w:val="20"/>
+                <w:szCs w:val="20"/>
+              </w:rPr>
+            </w:pPr>
+            <w:r>
+              <w:rPr>
+                <w:rFonts w:ascii="Cambria" w:hAnsi="Cambria"/>
+                <w:sz w:val="20"/>
+                <w:szCs w:val="20"/>
+              </w:rPr>
+              <w:t>kg</w:t>
+            </w:r>
+          </w:p>
+        </w:tc>
+        <w:tc>
+          <w:tcPr>
+            <w:tcW w:w="633" w:type="pct"/>
+          </w:tcPr>
+          <w:p>
+            <w:pPr>
+              <w:jc w:val="center"/>
+              <w:rPr>
+                <w:rFonts w:ascii="Cambria" w:hAnsi="Cambria"/>
+                <w:sz w:val="20"/>
+                <w:szCs w:val="20"/>
+              </w:rPr>
+            </w:pPr>
+            <w:r>
+              <w:rPr>
+                <w:rFonts w:ascii="Cambria" w:hAnsi="Cambria"/>
+                <w:sz w:val="20"/>
+                <w:szCs w:val="20"/>
+              </w:rPr>
+              <w:t>-</w:t>
+            </w:r>
+          </w:p>
+        </w:tc>
+        <w:tc>
+          <w:tcPr>
+            <w:tcW w:w="370" w:type="pct"/>
+          </w:tcPr>
+          <w:p>
+            <w:pPr>
+              <w:jc w:val="center"/>
+              <w:rPr>
+                <w:rFonts w:ascii="Cambria" w:hAnsi="Cambria"/>
+                <w:sz w:val="20"/>
+                <w:szCs w:val="20"/>
+              </w:rPr>
+            </w:pPr>
+            <w:r>
+              <w:rPr>
+                <w:rFonts w:ascii="Cambria" w:hAnsi="Cambria"/>
+                <w:sz w:val="20"/>
+                <w:szCs w:val="20"/>
+              </w:rPr>
+              <w:t>-</w:t>
+            </w:r>
+          </w:p>
+        </w:tc>
+        <w:tc>
+          <w:tcPr>
+            <w:tcW w:w="505" w:type="pct"/>
+          </w:tcPr>
+          <w:p>
+            <w:pPr>
+              <w:jc w:val="center"/>
+              <w:rPr>
+                <w:rFonts w:ascii="Cambria" w:hAnsi="Cambria"/>
+                <w:sz w:val="20"/>
+                <w:szCs w:val="20"/>
+              </w:rPr>
+            </w:pPr>
+            <w:r>
+              <w:rPr>
+                <w:rFonts w:ascii="Cambria" w:hAnsi="Cambria"/>
+                <w:sz w:val="20"/>
+                <w:szCs w:val="20"/>
+              </w:rPr>
+              <w:t>-</w:t>
+            </w:r>
+          </w:p>
+        </w:tc>
+        <w:tc>
+          <w:tcPr>
+            <w:tcW w:w="501" w:type="pct"/>
+          </w:tcPr>
+          <w:p>
+            <w:pPr>
+              <w:jc w:val="center"/>
+              <w:rPr>
+                <w:rFonts w:ascii="Cambria" w:hAnsi="Cambria"/>
+                <w:sz w:val="20"/>
+                <w:szCs w:val="20"/>
+              </w:rPr>
+            </w:pPr>
+            <w:r>
+              <w:rPr>
+                <w:rFonts w:ascii="Cambria" w:hAnsi="Cambria"/>
+                <w:sz w:val="20"/>
+                <w:szCs w:val="20"/>
+              </w:rPr>
+              <w:t>0.0499</w:t>
+            </w:r>
+          </w:p>
+        </w:tc>
+        <w:tc>
+          <w:tcPr>
+            <w:tcW w:w="508" w:type="pct"/>
+          </w:tcPr>
+          <w:p>
+            <w:pPr>
+              <w:jc w:val="center"/>
+              <w:rPr>
+                <w:rFonts w:ascii="Cambria" w:hAnsi="Cambria"/>
+                <w:sz w:val="20"/>
+                <w:szCs w:val="20"/>
+              </w:rPr>
+            </w:pPr>
+            <w:r>
+              <w:rPr>
+                <w:rFonts w:ascii="Cambria" w:hAnsi="Cambria"/>
+                <w:sz w:val="20"/>
+                <w:szCs w:val="20"/>
+              </w:rPr>
+              <w:t>-</w:t>
+            </w:r>
+          </w:p>
+        </w:tc>
+        <w:tc>
+          <w:tcPr>
+            <w:tcW w:w="521" w:type="pct"/>
+          </w:tcPr>
+          <w:p>
+            <w:pPr>
+              <w:jc w:val="center"/>
+              <w:rPr>
+                <w:rFonts w:ascii="Cambria" w:hAnsi="Cambria"/>
+                <w:sz w:val="20"/>
+                <w:szCs w:val="20"/>
+              </w:rPr>
+            </w:pPr>
+            <w:r>
+              <w:rPr>
+                <w:rFonts w:ascii="Cambria" w:hAnsi="Cambria"/>
+                <w:sz w:val="20"/>
+                <w:szCs w:val="20"/>
+              </w:rPr>
+              <w:t>-</w:t>
+            </w:r>
+          </w:p>
+        </w:tc>
+        <w:tc>
+          <w:tcPr>
+            <w:tcW w:w="507" w:type="pct"/>
+          </w:tcPr>
+          <w:p>
+            <w:pPr>
+              <w:jc w:val="center"/>
+              <w:rPr>
+                <w:rFonts w:ascii="Cambria" w:hAnsi="Cambria"/>
+                <w:sz w:val="20"/>
+                <w:szCs w:val="20"/>
+              </w:rPr>
+            </w:pPr>
+            <w:r>
+              <w:rPr>
+                <w:rFonts w:ascii="Cambria" w:hAnsi="Cambria"/>
+                <w:sz w:val="20"/>
+                <w:szCs w:val="20"/>
+              </w:rPr>
+              <w:t>-</w:t>
+            </w:r>
+          </w:p>
+        </w:tc>
+      </w:tr>
+      <w:tr>
+        <w:tc>
+          <w:tcPr>
+            <w:tcW w:w="456" w:type="pct"/>
+            <w:vMerge/>
+          </w:tcPr>
+          <w:p>
+            <w:pPr>
+              <w:rPr>
+                <w:rFonts w:ascii="Cambria" w:hAnsi="Cambria"/>
+                <w:sz w:val="20"/>
+                <w:szCs w:val="20"/>
+              </w:rPr>
+            </w:pPr>
+          </w:p>
+        </w:tc>
+        <w:tc>
+          <w:tcPr>
+            <w:tcW w:w="710" w:type="pct"/>
+            <w:vAlign w:val="center"/>
+          </w:tcPr>
+          <w:p>
+            <w:pPr>
+              <w:rPr>
+                <w:rFonts w:ascii="Cambria" w:hAnsi="Cambria"/>
+                <w:sz w:val="20"/>
+                <w:szCs w:val="20"/>
+              </w:rPr>
+            </w:pPr>
+            <w:r>
+              <w:rPr>
+                <w:rFonts w:ascii="Cambria" w:hAnsi="Cambria" w:cs="Times New Roman"/>
+                <w:sz w:val="20"/>
+                <w:szCs w:val="20"/>
+                <w:lang w:eastAsia="en-ID"/>
+              </w:rPr>
+              <w:t>N₂O</w:t>
+            </w:r>
+          </w:p>
+        </w:tc>
+        <w:tc>
+          <w:tcPr>
+            <w:tcW w:w="289" w:type="pct"/>
+          </w:tcPr>
+          <w:p>
+            <w:pPr>
+              <w:jc w:val="center"/>
+              <w:rPr>
+                <w:rFonts w:ascii="Cambria" w:hAnsi="Cambria"/>
+                <w:sz w:val="20"/>
+                <w:szCs w:val="20"/>
+              </w:rPr>
+            </w:pPr>
+            <w:r>
+              <w:rPr>
+                <w:rFonts w:ascii="Cambria" w:hAnsi="Cambria"/>
+                <w:sz w:val="20"/>
+                <w:szCs w:val="20"/>
+              </w:rPr>
+              <w:t>kg</w:t>
+            </w:r>
+          </w:p>
+        </w:tc>
+        <w:tc>
+          <w:tcPr>
+            <w:tcW w:w="633" w:type="pct"/>
+          </w:tcPr>
+          <w:p>
+            <w:pPr>
+              <w:jc w:val="center"/>
+              <w:rPr>
+                <w:rFonts w:ascii="Cambria" w:hAnsi="Cambria"/>
+                <w:sz w:val="20"/>
+                <w:szCs w:val="20"/>
+              </w:rPr>
+            </w:pPr>
+            <w:r>
+              <w:rPr>
+                <w:rFonts w:ascii="Cambria" w:hAnsi="Cambria"/>
+                <w:sz w:val="20"/>
+                <w:szCs w:val="20"/>
+              </w:rPr>
+              <w:t>-</w:t>
+            </w:r>
+          </w:p>
+        </w:tc>
+        <w:tc>
+          <w:tcPr>
+            <w:tcW w:w="370" w:type="pct"/>
+          </w:tcPr>
+          <w:p>
+            <w:pPr>
+              <w:jc w:val="center"/>
+              <w:rPr>
+                <w:rFonts w:ascii="Cambria" w:hAnsi="Cambria"/>
+                <w:sz w:val="20"/>
+                <w:szCs w:val="20"/>
+              </w:rPr>
+            </w:pPr>
+            <w:r>
+              <w:rPr>
+                <w:rFonts w:ascii="Cambria" w:hAnsi="Cambria"/>
+                <w:sz w:val="20"/>
+                <w:szCs w:val="20"/>
+              </w:rPr>
+              <w:t>-</w:t>
+            </w:r>
+          </w:p>
+        </w:tc>
+        <w:tc>
+          <w:tcPr>
+            <w:tcW w:w="505" w:type="pct"/>
+          </w:tcPr>
+          <w:p>
+            <w:pPr>
+              <w:jc w:val="center"/>
+              <w:rPr>
+                <w:rFonts w:ascii="Cambria" w:hAnsi="Cambria"/>
+                <w:sz w:val="20"/>
+                <w:szCs w:val="20"/>
+              </w:rPr>
+            </w:pPr>
+            <w:r>
+              <w:rPr>
+                <w:rFonts w:ascii="Cambria" w:hAnsi="Cambria"/>
+                <w:sz w:val="20"/>
+                <w:szCs w:val="20"/>
+              </w:rPr>
+              <w:t>-</w:t>
+            </w:r>
+          </w:p>
+        </w:tc>
+        <w:tc>
+          <w:tcPr>
+            <w:tcW w:w="501" w:type="pct"/>
+          </w:tcPr>
+          <w:p>
+            <w:pPr>
+              <w:jc w:val="center"/>
+              <w:rPr>
+                <w:rFonts w:ascii="Cambria" w:hAnsi="Cambria"/>
+                <w:sz w:val="20"/>
+                <w:szCs w:val="20"/>
+              </w:rPr>
+            </w:pPr>
+            <w:r>
+              <w:rPr>
+                <w:rFonts w:ascii="Cambria" w:hAnsi="Cambria"/>
+                <w:sz w:val="20"/>
+                <w:szCs w:val="20"/>
+              </w:rPr>
+              <w:t>0.3744</w:t>
+            </w:r>
+          </w:p>
+        </w:tc>
+        <w:tc>
+          <w:tcPr>
+            <w:tcW w:w="508" w:type="pct"/>
+          </w:tcPr>
+          <w:p>
+            <w:pPr>
+              <w:jc w:val="center"/>
+              <w:rPr>
+                <w:rFonts w:ascii="Cambria" w:hAnsi="Cambria"/>
+                <w:sz w:val="20"/>
+                <w:szCs w:val="20"/>
+              </w:rPr>
+            </w:pPr>
+            <w:r>
+              <w:rPr>
+                <w:rFonts w:ascii="Cambria" w:hAnsi="Cambria"/>
+                <w:sz w:val="20"/>
+                <w:szCs w:val="20"/>
+              </w:rPr>
+              <w:t>-</w:t>
+            </w:r>
+          </w:p>
+        </w:tc>
+        <w:tc>
+          <w:tcPr>
+            <w:tcW w:w="521" w:type="pct"/>
+          </w:tcPr>
+          <w:p>
+            <w:pPr>
+              <w:jc w:val="center"/>
+              <w:rPr>
+                <w:rFonts w:ascii="Cambria" w:hAnsi="Cambria"/>
+                <w:sz w:val="20"/>
+                <w:szCs w:val="20"/>
+              </w:rPr>
+            </w:pPr>
+            <w:r>
+              <w:rPr>
+                <w:rFonts w:ascii="Cambria" w:hAnsi="Cambria"/>
+                <w:sz w:val="20"/>
+                <w:szCs w:val="20"/>
+              </w:rPr>
+              <w:t>-</w:t>
+            </w:r>
+          </w:p>
+        </w:tc>
+        <w:tc>
+          <w:tcPr>
+            <w:tcW w:w="507" w:type="pct"/>
+          </w:tcPr>
+          <w:p>
+            <w:pPr>
+              <w:jc w:val="center"/>
+              <w:rPr>
+                <w:rFonts w:ascii="Cambria" w:hAnsi="Cambria"/>
+                <w:sz w:val="20"/>
+                <w:szCs w:val="20"/>
+              </w:rPr>
+            </w:pPr>
+            <w:r>
+              <w:rPr>
+                <w:rFonts w:ascii="Cambria" w:hAnsi="Cambria"/>
+                <w:sz w:val="20"/>
+                <w:szCs w:val="20"/>
+              </w:rPr>
+              <w:t>-</w:t>
+            </w:r>
+          </w:p>
+        </w:tc>
+      </w:tr>
+      <w:tr>
+        <w:tc>
+          <w:tcPr>
+            <w:tcW w:w="456" w:type="pct"/>
+            <w:vMerge w:val="restart"/>
+          </w:tcPr>
+          <w:p>
+            <w:r>
+              <w:t>Emission to water</w:t>
+            </w:r>
           </w:p>
         </w:tc>
         <w:tc>
@@ -3472,7 +4364,7 @@
                 <w:sz w:val="20"/>
                 <w:szCs w:val="20"/>
               </w:rPr>
-              <w:t>Okara</w:t>
+              <w:t>Wastewater</w:t>
             </w:r>
           </w:p>
         </w:tc>
@@ -3499,7 +4391,7 @@
                 <w:sz w:val="20"/>
                 <w:szCs w:val="20"/>
               </w:rPr>
-              <w:t>kg</w:t>
+              <w:t>L</w:t>
             </w:r>
           </w:p>
         </w:tc>
@@ -3526,7 +4418,7 @@
                 <w:sz w:val="20"/>
                 <w:szCs w:val="20"/>
               </w:rPr>
-              <w:t>-</w:t>
+              <w:t>2660</w:t>
             </w:r>
           </w:p>
         </w:tc>
@@ -3553,7 +4445,7 @@
                 <w:sz w:val="20"/>
                 <w:szCs w:val="20"/>
               </w:rPr>
-              <w:t>-</w:t>
+              <w:t>600</w:t>
             </w:r>
           </w:p>
         </w:tc>
@@ -3634,7 +4526,7 @@
                 <w:sz w:val="20"/>
                 <w:szCs w:val="20"/>
               </w:rPr>
-              <w:t>1600</w:t>
+              <w:t>-</w:t>
             </w:r>
           </w:p>
         </w:tc>
@@ -3688,7 +4580,7 @@
                 <w:sz w:val="20"/>
                 <w:szCs w:val="20"/>
               </w:rPr>
-              <w:t>-</w:t>
+              <w:t>100</w:t>
             </w:r>
           </w:p>
         </w:tc>
@@ -3700,13 +4592,7 @@
             <w:vMerge/>
           </w:tcPr>
           <w:p>
-            <w:pPr>
-              <w:rPr>
-                <w:rFonts w:ascii="Cambria" w:hAnsi="Cambria"/>
-                <w:sz w:val="20"/>
-                <w:szCs w:val="20"/>
-              </w:rPr>
-            </w:pPr>
+            <w:r/>
           </w:p>
         </w:tc>
         <w:tc>
@@ -3727,11 +4613,12 @@
             </w:pPr>
             <w:r>
               <w:rPr>
-                <w:rFonts w:ascii="Cambria" w:hAnsi="Cambria"/>
-                <w:sz w:val="20"/>
-                <w:szCs w:val="20"/>
-              </w:rPr>
-              <w:t>Steam loss</w:t>
+                <w:rFonts w:ascii="Cambria" w:hAnsi="Cambria" w:cs="Times New Roman"/>
+                <w:sz w:val="20"/>
+                <w:szCs w:val="20"/>
+                <w:lang w:eastAsia="en-ID"/>
+              </w:rPr>
+              <w:t>Whey</w:t>
             </w:r>
           </w:p>
         </w:tc>
@@ -3866,7 +4753,7 @@
                 <w:sz w:val="20"/>
                 <w:szCs w:val="20"/>
               </w:rPr>
-              <w:t>588</w:t>
+              <w:t>-</w:t>
             </w:r>
           </w:p>
         </w:tc>
@@ -3920,7 +4807,7 @@
                 <w:sz w:val="20"/>
                 <w:szCs w:val="20"/>
               </w:rPr>
-              <w:t>-</w:t>
+              <w:t>10434</w:t>
             </w:r>
           </w:p>
         </w:tc>
@@ -3931,903 +4818,6 @@
               <w:top w:val="nil"/>
               <w:bottom w:val="nil"/>
             </w:tcBorders>
-          </w:tcPr>
-          <w:p>
-            <w:pPr>
-              <w:jc w:val="center"/>
-              <w:rPr>
-                <w:rFonts w:ascii="Cambria" w:hAnsi="Cambria"/>
-                <w:sz w:val="20"/>
-                <w:szCs w:val="20"/>
-              </w:rPr>
-            </w:pPr>
-            <w:r>
-              <w:rPr>
-                <w:rFonts w:ascii="Cambria" w:hAnsi="Cambria"/>
-                <w:sz w:val="20"/>
-                <w:szCs w:val="20"/>
-              </w:rPr>
-              <w:t>-</w:t>
-            </w:r>
-          </w:p>
-        </w:tc>
-      </w:tr>
-      <w:tr>
-        <w:tc>
-          <w:tcPr>
-            <w:tcW w:w="456" w:type="pct"/>
-            <w:vMerge/>
-            <w:tcBorders>
-              <w:bottom w:val="single" w:sz="4" w:space="0" w:color="auto"/>
-            </w:tcBorders>
-          </w:tcPr>
-          <w:p>
-            <w:pPr>
-              <w:rPr>
-                <w:rFonts w:ascii="Cambria" w:hAnsi="Cambria"/>
-                <w:sz w:val="20"/>
-                <w:szCs w:val="20"/>
-              </w:rPr>
-            </w:pPr>
-          </w:p>
-        </w:tc>
-        <w:tc>
-          <w:tcPr>
-            <w:tcW w:w="710" w:type="pct"/>
-            <w:tcBorders>
-              <w:top w:val="nil"/>
-              <w:bottom w:val="single" w:sz="4" w:space="0" w:color="auto"/>
-            </w:tcBorders>
-          </w:tcPr>
-          <w:p>
-            <w:pPr>
-              <w:rPr>
-                <w:rFonts w:ascii="Cambria" w:hAnsi="Cambria"/>
-                <w:sz w:val="20"/>
-                <w:szCs w:val="20"/>
-              </w:rPr>
-            </w:pPr>
-            <w:r>
-              <w:rPr>
-                <w:rFonts w:ascii="Cambria" w:hAnsi="Cambria"/>
-                <w:sz w:val="20"/>
-                <w:szCs w:val="20"/>
-              </w:rPr>
-              <w:t>Wood ashes</w:t>
-            </w:r>
-          </w:p>
-        </w:tc>
-        <w:tc>
-          <w:tcPr>
-            <w:tcW w:w="289" w:type="pct"/>
-            <w:tcBorders>
-              <w:top w:val="nil"/>
-              <w:bottom w:val="single" w:sz="4" w:space="0" w:color="auto"/>
-            </w:tcBorders>
-          </w:tcPr>
-          <w:p>
-            <w:pPr>
-              <w:jc w:val="center"/>
-              <w:rPr>
-                <w:rFonts w:ascii="Cambria" w:hAnsi="Cambria"/>
-                <w:sz w:val="20"/>
-                <w:szCs w:val="20"/>
-              </w:rPr>
-            </w:pPr>
-            <w:r>
-              <w:rPr>
-                <w:rFonts w:ascii="Cambria" w:hAnsi="Cambria"/>
-                <w:sz w:val="20"/>
-                <w:szCs w:val="20"/>
-              </w:rPr>
-              <w:t>kg</w:t>
-            </w:r>
-          </w:p>
-        </w:tc>
-        <w:tc>
-          <w:tcPr>
-            <w:tcW w:w="633" w:type="pct"/>
-            <w:tcBorders>
-              <w:top w:val="nil"/>
-              <w:bottom w:val="single" w:sz="4" w:space="0" w:color="auto"/>
-            </w:tcBorders>
-          </w:tcPr>
-          <w:p>
-            <w:pPr>
-              <w:jc w:val="center"/>
-              <w:rPr>
-                <w:rFonts w:ascii="Cambria" w:hAnsi="Cambria"/>
-                <w:sz w:val="20"/>
-                <w:szCs w:val="20"/>
-              </w:rPr>
-            </w:pPr>
-          </w:p>
-        </w:tc>
-        <w:tc>
-          <w:tcPr>
-            <w:tcW w:w="370" w:type="pct"/>
-            <w:tcBorders>
-              <w:top w:val="nil"/>
-              <w:bottom w:val="single" w:sz="4" w:space="0" w:color="auto"/>
-            </w:tcBorders>
-          </w:tcPr>
-          <w:p>
-            <w:pPr>
-              <w:jc w:val="center"/>
-              <w:rPr>
-                <w:rFonts w:ascii="Cambria" w:hAnsi="Cambria"/>
-                <w:sz w:val="20"/>
-                <w:szCs w:val="20"/>
-              </w:rPr>
-            </w:pPr>
-          </w:p>
-        </w:tc>
-        <w:tc>
-          <w:tcPr>
-            <w:tcW w:w="505" w:type="pct"/>
-            <w:tcBorders>
-              <w:top w:val="nil"/>
-              <w:bottom w:val="single" w:sz="4" w:space="0" w:color="auto"/>
-            </w:tcBorders>
-          </w:tcPr>
-          <w:p>
-            <w:pPr>
-              <w:jc w:val="center"/>
-              <w:rPr>
-                <w:rFonts w:ascii="Cambria" w:hAnsi="Cambria"/>
-                <w:sz w:val="20"/>
-                <w:szCs w:val="20"/>
-              </w:rPr>
-            </w:pPr>
-          </w:p>
-        </w:tc>
-        <w:tc>
-          <w:tcPr>
-            <w:tcW w:w="501" w:type="pct"/>
-            <w:tcBorders>
-              <w:top w:val="nil"/>
-              <w:bottom w:val="single" w:sz="4" w:space="0" w:color="auto"/>
-            </w:tcBorders>
-          </w:tcPr>
-          <w:p>
-            <w:pPr>
-              <w:jc w:val="center"/>
-              <w:rPr>
-                <w:rFonts w:ascii="Cambria" w:hAnsi="Cambria"/>
-                <w:sz w:val="20"/>
-                <w:szCs w:val="20"/>
-              </w:rPr>
-            </w:pPr>
-            <w:r>
-              <w:rPr>
-                <w:rFonts w:ascii="Cambria" w:hAnsi="Cambria"/>
-                <w:sz w:val="20"/>
-                <w:szCs w:val="20"/>
-              </w:rPr>
-              <w:t>16</w:t>
-            </w:r>
-          </w:p>
-        </w:tc>
-        <w:tc>
-          <w:tcPr>
-            <w:tcW w:w="508" w:type="pct"/>
-            <w:tcBorders>
-              <w:top w:val="nil"/>
-              <w:bottom w:val="single" w:sz="4" w:space="0" w:color="auto"/>
-            </w:tcBorders>
-          </w:tcPr>
-          <w:p>
-            <w:pPr>
-              <w:jc w:val="center"/>
-              <w:rPr>
-                <w:rFonts w:ascii="Cambria" w:hAnsi="Cambria"/>
-                <w:sz w:val="20"/>
-                <w:szCs w:val="20"/>
-              </w:rPr>
-            </w:pPr>
-          </w:p>
-        </w:tc>
-        <w:tc>
-          <w:tcPr>
-            <w:tcW w:w="521" w:type="pct"/>
-            <w:tcBorders>
-              <w:top w:val="nil"/>
-              <w:bottom w:val="single" w:sz="4" w:space="0" w:color="auto"/>
-            </w:tcBorders>
-          </w:tcPr>
-          <w:p>
-            <w:pPr>
-              <w:jc w:val="center"/>
-              <w:rPr>
-                <w:rFonts w:ascii="Cambria" w:hAnsi="Cambria"/>
-                <w:sz w:val="20"/>
-                <w:szCs w:val="20"/>
-              </w:rPr>
-            </w:pPr>
-          </w:p>
-        </w:tc>
-        <w:tc>
-          <w:tcPr>
-            <w:tcW w:w="507" w:type="pct"/>
-            <w:tcBorders>
-              <w:top w:val="nil"/>
-              <w:bottom w:val="single" w:sz="4" w:space="0" w:color="auto"/>
-            </w:tcBorders>
-          </w:tcPr>
-          <w:p>
-            <w:pPr>
-              <w:jc w:val="center"/>
-              <w:rPr>
-                <w:rFonts w:ascii="Cambria" w:hAnsi="Cambria"/>
-                <w:sz w:val="20"/>
-                <w:szCs w:val="20"/>
-              </w:rPr>
-            </w:pPr>
-          </w:p>
-        </w:tc>
-      </w:tr>
-      <w:tr>
-        <w:tc>
-          <w:tcPr>
-            <w:tcW w:w="456" w:type="pct"/>
-            <w:vMerge w:val="restart"/>
-          </w:tcPr>
-          <w:p>
-            <w:pPr>
-              <w:rPr>
-                <w:rFonts w:ascii="Cambria" w:hAnsi="Cambria"/>
-                <w:sz w:val="20"/>
-                <w:szCs w:val="20"/>
-              </w:rPr>
-            </w:pPr>
-            <w:r>
-              <w:rPr>
-                <w:rFonts w:ascii="Cambria" w:hAnsi="Cambria"/>
-                <w:sz w:val="20"/>
-                <w:szCs w:val="20"/>
-              </w:rPr>
-              <w:t>Emission</w:t>
-            </w:r>
-          </w:p>
-        </w:tc>
-        <w:tc>
-          <w:tcPr>
-            <w:tcW w:w="710" w:type="pct"/>
-            <w:vAlign w:val="center"/>
-          </w:tcPr>
-          <w:p>
-            <w:pPr>
-              <w:rPr>
-                <w:rFonts w:ascii="Cambria" w:hAnsi="Cambria"/>
-                <w:sz w:val="20"/>
-                <w:szCs w:val="20"/>
-              </w:rPr>
-            </w:pPr>
-            <w:r>
-              <w:rPr>
-                <w:rFonts w:ascii="Cambria" w:hAnsi="Cambria" w:cs="Times New Roman"/>
-                <w:sz w:val="20"/>
-                <w:szCs w:val="20"/>
-                <w:lang w:eastAsia="en-ID"/>
-              </w:rPr>
-              <w:t>CO₂</w:t>
-            </w:r>
-          </w:p>
-        </w:tc>
-        <w:tc>
-          <w:tcPr>
-            <w:tcW w:w="289" w:type="pct"/>
-          </w:tcPr>
-          <w:p>
-            <w:pPr>
-              <w:jc w:val="center"/>
-              <w:rPr>
-                <w:rFonts w:ascii="Cambria" w:hAnsi="Cambria"/>
-                <w:sz w:val="20"/>
-                <w:szCs w:val="20"/>
-              </w:rPr>
-            </w:pPr>
-            <w:r>
-              <w:rPr>
-                <w:rFonts w:ascii="Cambria" w:hAnsi="Cambria"/>
-                <w:sz w:val="20"/>
-                <w:szCs w:val="20"/>
-              </w:rPr>
-              <w:t>kg</w:t>
-            </w:r>
-          </w:p>
-        </w:tc>
-        <w:tc>
-          <w:tcPr>
-            <w:tcW w:w="633" w:type="pct"/>
-          </w:tcPr>
-          <w:p>
-            <w:pPr>
-              <w:jc w:val="center"/>
-              <w:rPr>
-                <w:rFonts w:ascii="Cambria" w:hAnsi="Cambria"/>
-                <w:sz w:val="20"/>
-                <w:szCs w:val="20"/>
-              </w:rPr>
-            </w:pPr>
-            <w:r>
-              <w:rPr>
-                <w:rFonts w:ascii="Cambria" w:hAnsi="Cambria"/>
-                <w:sz w:val="20"/>
-                <w:szCs w:val="20"/>
-              </w:rPr>
-              <w:t>0.51</w:t>
-            </w:r>
-          </w:p>
-        </w:tc>
-        <w:tc>
-          <w:tcPr>
-            <w:tcW w:w="370" w:type="pct"/>
-          </w:tcPr>
-          <w:p>
-            <w:pPr>
-              <w:jc w:val="center"/>
-              <w:rPr>
-                <w:rFonts w:ascii="Cambria" w:hAnsi="Cambria"/>
-                <w:sz w:val="20"/>
-                <w:szCs w:val="20"/>
-              </w:rPr>
-            </w:pPr>
-            <w:r>
-              <w:rPr>
-                <w:rFonts w:ascii="Cambria" w:hAnsi="Cambria"/>
-                <w:sz w:val="20"/>
-                <w:szCs w:val="20"/>
-              </w:rPr>
-              <w:t>0.38</w:t>
-            </w:r>
-          </w:p>
-        </w:tc>
-        <w:tc>
-          <w:tcPr>
-            <w:tcW w:w="505" w:type="pct"/>
-          </w:tcPr>
-          <w:p>
-            <w:pPr>
-              <w:jc w:val="center"/>
-              <w:rPr>
-                <w:rFonts w:ascii="Cambria" w:hAnsi="Cambria"/>
-                <w:sz w:val="20"/>
-                <w:szCs w:val="20"/>
-              </w:rPr>
-            </w:pPr>
-            <w:r>
-              <w:rPr>
-                <w:rFonts w:ascii="Cambria" w:hAnsi="Cambria"/>
-                <w:sz w:val="20"/>
-                <w:szCs w:val="20"/>
-              </w:rPr>
-              <w:t>14.45</w:t>
-            </w:r>
-          </w:p>
-        </w:tc>
-        <w:tc>
-          <w:tcPr>
-            <w:tcW w:w="501" w:type="pct"/>
-          </w:tcPr>
-          <w:p>
-            <w:pPr>
-              <w:jc w:val="center"/>
-              <w:rPr>
-                <w:rFonts w:ascii="Cambria" w:hAnsi="Cambria"/>
-                <w:sz w:val="20"/>
-                <w:szCs w:val="20"/>
-              </w:rPr>
-            </w:pPr>
-            <w:r>
-              <w:rPr>
-                <w:rFonts w:ascii="Cambria" w:hAnsi="Cambria"/>
-                <w:sz w:val="20"/>
-                <w:szCs w:val="20"/>
-              </w:rPr>
-              <w:t>1397</w:t>
-            </w:r>
-          </w:p>
-        </w:tc>
-        <w:tc>
-          <w:tcPr>
-            <w:tcW w:w="508" w:type="pct"/>
-          </w:tcPr>
-          <w:p>
-            <w:pPr>
-              <w:jc w:val="center"/>
-              <w:rPr>
-                <w:rFonts w:ascii="Cambria" w:hAnsi="Cambria"/>
-                <w:sz w:val="20"/>
-                <w:szCs w:val="20"/>
-              </w:rPr>
-            </w:pPr>
-            <w:r>
-              <w:rPr>
-                <w:rFonts w:ascii="Cambria" w:hAnsi="Cambria"/>
-                <w:sz w:val="20"/>
-                <w:szCs w:val="20"/>
-              </w:rPr>
-              <w:t>-</w:t>
-            </w:r>
-          </w:p>
-        </w:tc>
-        <w:tc>
-          <w:tcPr>
-            <w:tcW w:w="521" w:type="pct"/>
-          </w:tcPr>
-          <w:p>
-            <w:pPr>
-              <w:jc w:val="center"/>
-              <w:rPr>
-                <w:rFonts w:ascii="Cambria" w:hAnsi="Cambria"/>
-                <w:sz w:val="20"/>
-                <w:szCs w:val="20"/>
-              </w:rPr>
-            </w:pPr>
-            <w:r>
-              <w:rPr>
-                <w:rFonts w:ascii="Cambria" w:hAnsi="Cambria"/>
-                <w:sz w:val="20"/>
-                <w:szCs w:val="20"/>
-              </w:rPr>
-              <w:t>-</w:t>
-            </w:r>
-          </w:p>
-        </w:tc>
-        <w:tc>
-          <w:tcPr>
-            <w:tcW w:w="507" w:type="pct"/>
-          </w:tcPr>
-          <w:p>
-            <w:pPr>
-              <w:jc w:val="center"/>
-              <w:rPr>
-                <w:rFonts w:ascii="Cambria" w:hAnsi="Cambria"/>
-                <w:sz w:val="20"/>
-                <w:szCs w:val="20"/>
-              </w:rPr>
-            </w:pPr>
-            <w:r>
-              <w:rPr>
-                <w:rFonts w:ascii="Cambria" w:hAnsi="Cambria"/>
-                <w:sz w:val="20"/>
-                <w:szCs w:val="20"/>
-              </w:rPr>
-              <w:t>-</w:t>
-            </w:r>
-          </w:p>
-        </w:tc>
-      </w:tr>
-      <w:tr>
-        <w:tc>
-          <w:tcPr>
-            <w:tcW w:w="456" w:type="pct"/>
-            <w:vMerge/>
-          </w:tcPr>
-          <w:p>
-            <w:pPr>
-              <w:rPr>
-                <w:rFonts w:ascii="Cambria" w:hAnsi="Cambria"/>
-                <w:sz w:val="20"/>
-                <w:szCs w:val="20"/>
-              </w:rPr>
-            </w:pPr>
-          </w:p>
-        </w:tc>
-        <w:tc>
-          <w:tcPr>
-            <w:tcW w:w="710" w:type="pct"/>
-            <w:vAlign w:val="center"/>
-          </w:tcPr>
-          <w:p>
-            <w:pPr>
-              <w:rPr>
-                <w:rFonts w:ascii="Cambria" w:hAnsi="Cambria"/>
-                <w:sz w:val="20"/>
-                <w:szCs w:val="20"/>
-              </w:rPr>
-            </w:pPr>
-            <w:r>
-              <w:rPr>
-                <w:rFonts w:ascii="Cambria" w:hAnsi="Cambria" w:cs="Times New Roman"/>
-                <w:sz w:val="20"/>
-                <w:szCs w:val="20"/>
-                <w:lang w:eastAsia="en-ID"/>
-              </w:rPr>
-              <w:t xml:space="preserve">CH₄ </w:t>
-            </w:r>
-          </w:p>
-        </w:tc>
-        <w:tc>
-          <w:tcPr>
-            <w:tcW w:w="289" w:type="pct"/>
-          </w:tcPr>
-          <w:p>
-            <w:pPr>
-              <w:jc w:val="center"/>
-              <w:rPr>
-                <w:rFonts w:ascii="Cambria" w:hAnsi="Cambria"/>
-                <w:sz w:val="20"/>
-                <w:szCs w:val="20"/>
-              </w:rPr>
-            </w:pPr>
-            <w:r>
-              <w:rPr>
-                <w:rFonts w:ascii="Cambria" w:hAnsi="Cambria"/>
-                <w:sz w:val="20"/>
-                <w:szCs w:val="20"/>
-              </w:rPr>
-              <w:t>kg</w:t>
-            </w:r>
-          </w:p>
-        </w:tc>
-        <w:tc>
-          <w:tcPr>
-            <w:tcW w:w="633" w:type="pct"/>
-          </w:tcPr>
-          <w:p>
-            <w:pPr>
-              <w:jc w:val="center"/>
-              <w:rPr>
-                <w:rFonts w:ascii="Cambria" w:hAnsi="Cambria"/>
-                <w:sz w:val="20"/>
-                <w:szCs w:val="20"/>
-              </w:rPr>
-            </w:pPr>
-            <w:r>
-              <w:rPr>
-                <w:rFonts w:ascii="Cambria" w:hAnsi="Cambria"/>
-                <w:sz w:val="20"/>
-                <w:szCs w:val="20"/>
-              </w:rPr>
-              <w:t>-</w:t>
-            </w:r>
-          </w:p>
-        </w:tc>
-        <w:tc>
-          <w:tcPr>
-            <w:tcW w:w="370" w:type="pct"/>
-          </w:tcPr>
-          <w:p>
-            <w:pPr>
-              <w:jc w:val="center"/>
-              <w:rPr>
-                <w:rFonts w:ascii="Cambria" w:hAnsi="Cambria"/>
-                <w:sz w:val="20"/>
-                <w:szCs w:val="20"/>
-              </w:rPr>
-            </w:pPr>
-            <w:r>
-              <w:rPr>
-                <w:rFonts w:ascii="Cambria" w:hAnsi="Cambria"/>
-                <w:sz w:val="20"/>
-                <w:szCs w:val="20"/>
-              </w:rPr>
-              <w:t>-</w:t>
-            </w:r>
-          </w:p>
-        </w:tc>
-        <w:tc>
-          <w:tcPr>
-            <w:tcW w:w="505" w:type="pct"/>
-          </w:tcPr>
-          <w:p>
-            <w:pPr>
-              <w:jc w:val="center"/>
-              <w:rPr>
-                <w:rFonts w:ascii="Cambria" w:hAnsi="Cambria"/>
-                <w:sz w:val="20"/>
-                <w:szCs w:val="20"/>
-              </w:rPr>
-            </w:pPr>
-            <w:r>
-              <w:rPr>
-                <w:rFonts w:ascii="Cambria" w:hAnsi="Cambria"/>
-                <w:sz w:val="20"/>
-                <w:szCs w:val="20"/>
-              </w:rPr>
-              <w:t>-</w:t>
-            </w:r>
-          </w:p>
-        </w:tc>
-        <w:tc>
-          <w:tcPr>
-            <w:tcW w:w="501" w:type="pct"/>
-          </w:tcPr>
-          <w:p>
-            <w:pPr>
-              <w:jc w:val="center"/>
-              <w:rPr>
-                <w:rFonts w:ascii="Cambria" w:hAnsi="Cambria"/>
-                <w:sz w:val="20"/>
-                <w:szCs w:val="20"/>
-              </w:rPr>
-            </w:pPr>
-            <w:r>
-              <w:rPr>
-                <w:rFonts w:ascii="Cambria" w:hAnsi="Cambria"/>
-                <w:sz w:val="20"/>
-                <w:szCs w:val="20"/>
-              </w:rPr>
-              <w:t>0.0499</w:t>
-            </w:r>
-          </w:p>
-        </w:tc>
-        <w:tc>
-          <w:tcPr>
-            <w:tcW w:w="508" w:type="pct"/>
-          </w:tcPr>
-          <w:p>
-            <w:pPr>
-              <w:jc w:val="center"/>
-              <w:rPr>
-                <w:rFonts w:ascii="Cambria" w:hAnsi="Cambria"/>
-                <w:sz w:val="20"/>
-                <w:szCs w:val="20"/>
-              </w:rPr>
-            </w:pPr>
-            <w:r>
-              <w:rPr>
-                <w:rFonts w:ascii="Cambria" w:hAnsi="Cambria"/>
-                <w:sz w:val="20"/>
-                <w:szCs w:val="20"/>
-              </w:rPr>
-              <w:t>-</w:t>
-            </w:r>
-          </w:p>
-        </w:tc>
-        <w:tc>
-          <w:tcPr>
-            <w:tcW w:w="521" w:type="pct"/>
-          </w:tcPr>
-          <w:p>
-            <w:pPr>
-              <w:jc w:val="center"/>
-              <w:rPr>
-                <w:rFonts w:ascii="Cambria" w:hAnsi="Cambria"/>
-                <w:sz w:val="20"/>
-                <w:szCs w:val="20"/>
-              </w:rPr>
-            </w:pPr>
-            <w:r>
-              <w:rPr>
-                <w:rFonts w:ascii="Cambria" w:hAnsi="Cambria"/>
-                <w:sz w:val="20"/>
-                <w:szCs w:val="20"/>
-              </w:rPr>
-              <w:t>-</w:t>
-            </w:r>
-          </w:p>
-        </w:tc>
-        <w:tc>
-          <w:tcPr>
-            <w:tcW w:w="507" w:type="pct"/>
-          </w:tcPr>
-          <w:p>
-            <w:pPr>
-              <w:jc w:val="center"/>
-              <w:rPr>
-                <w:rFonts w:ascii="Cambria" w:hAnsi="Cambria"/>
-                <w:sz w:val="20"/>
-                <w:szCs w:val="20"/>
-              </w:rPr>
-            </w:pPr>
-            <w:r>
-              <w:rPr>
-                <w:rFonts w:ascii="Cambria" w:hAnsi="Cambria"/>
-                <w:sz w:val="20"/>
-                <w:szCs w:val="20"/>
-              </w:rPr>
-              <w:t>-</w:t>
-            </w:r>
-          </w:p>
-        </w:tc>
-      </w:tr>
-      <w:tr>
-        <w:tc>
-          <w:tcPr>
-            <w:tcW w:w="456" w:type="pct"/>
-            <w:vMerge/>
-          </w:tcPr>
-          <w:p>
-            <w:pPr>
-              <w:rPr>
-                <w:rFonts w:ascii="Cambria" w:hAnsi="Cambria"/>
-                <w:sz w:val="20"/>
-                <w:szCs w:val="20"/>
-              </w:rPr>
-            </w:pPr>
-          </w:p>
-        </w:tc>
-        <w:tc>
-          <w:tcPr>
-            <w:tcW w:w="710" w:type="pct"/>
-            <w:vAlign w:val="center"/>
-          </w:tcPr>
-          <w:p>
-            <w:pPr>
-              <w:rPr>
-                <w:rFonts w:ascii="Cambria" w:hAnsi="Cambria"/>
-                <w:sz w:val="20"/>
-                <w:szCs w:val="20"/>
-              </w:rPr>
-            </w:pPr>
-            <w:r>
-              <w:rPr>
-                <w:rFonts w:ascii="Cambria" w:hAnsi="Cambria" w:cs="Times New Roman"/>
-                <w:sz w:val="20"/>
-                <w:szCs w:val="20"/>
-                <w:lang w:eastAsia="en-ID"/>
-              </w:rPr>
-              <w:t>N₂O</w:t>
-            </w:r>
-          </w:p>
-        </w:tc>
-        <w:tc>
-          <w:tcPr>
-            <w:tcW w:w="289" w:type="pct"/>
-          </w:tcPr>
-          <w:p>
-            <w:pPr>
-              <w:jc w:val="center"/>
-              <w:rPr>
-                <w:rFonts w:ascii="Cambria" w:hAnsi="Cambria"/>
-                <w:sz w:val="20"/>
-                <w:szCs w:val="20"/>
-              </w:rPr>
-            </w:pPr>
-            <w:r>
-              <w:rPr>
-                <w:rFonts w:ascii="Cambria" w:hAnsi="Cambria"/>
-                <w:sz w:val="20"/>
-                <w:szCs w:val="20"/>
-              </w:rPr>
-              <w:t>kg</w:t>
-            </w:r>
-          </w:p>
-        </w:tc>
-        <w:tc>
-          <w:tcPr>
-            <w:tcW w:w="633" w:type="pct"/>
-          </w:tcPr>
-          <w:p>
-            <w:pPr>
-              <w:jc w:val="center"/>
-              <w:rPr>
-                <w:rFonts w:ascii="Cambria" w:hAnsi="Cambria"/>
-                <w:sz w:val="20"/>
-                <w:szCs w:val="20"/>
-              </w:rPr>
-            </w:pPr>
-            <w:r>
-              <w:rPr>
-                <w:rFonts w:ascii="Cambria" w:hAnsi="Cambria"/>
-                <w:sz w:val="20"/>
-                <w:szCs w:val="20"/>
-              </w:rPr>
-              <w:t>-</w:t>
-            </w:r>
-          </w:p>
-        </w:tc>
-        <w:tc>
-          <w:tcPr>
-            <w:tcW w:w="370" w:type="pct"/>
-          </w:tcPr>
-          <w:p>
-            <w:pPr>
-              <w:jc w:val="center"/>
-              <w:rPr>
-                <w:rFonts w:ascii="Cambria" w:hAnsi="Cambria"/>
-                <w:sz w:val="20"/>
-                <w:szCs w:val="20"/>
-              </w:rPr>
-            </w:pPr>
-            <w:r>
-              <w:rPr>
-                <w:rFonts w:ascii="Cambria" w:hAnsi="Cambria"/>
-                <w:sz w:val="20"/>
-                <w:szCs w:val="20"/>
-              </w:rPr>
-              <w:t>-</w:t>
-            </w:r>
-          </w:p>
-        </w:tc>
-        <w:tc>
-          <w:tcPr>
-            <w:tcW w:w="505" w:type="pct"/>
-          </w:tcPr>
-          <w:p>
-            <w:pPr>
-              <w:jc w:val="center"/>
-              <w:rPr>
-                <w:rFonts w:ascii="Cambria" w:hAnsi="Cambria"/>
-                <w:sz w:val="20"/>
-                <w:szCs w:val="20"/>
-              </w:rPr>
-            </w:pPr>
-            <w:r>
-              <w:rPr>
-                <w:rFonts w:ascii="Cambria" w:hAnsi="Cambria"/>
-                <w:sz w:val="20"/>
-                <w:szCs w:val="20"/>
-              </w:rPr>
-              <w:t>-</w:t>
-            </w:r>
-          </w:p>
-        </w:tc>
-        <w:tc>
-          <w:tcPr>
-            <w:tcW w:w="501" w:type="pct"/>
-          </w:tcPr>
-          <w:p>
-            <w:pPr>
-              <w:jc w:val="center"/>
-              <w:rPr>
-                <w:rFonts w:ascii="Cambria" w:hAnsi="Cambria"/>
-                <w:sz w:val="20"/>
-                <w:szCs w:val="20"/>
-              </w:rPr>
-            </w:pPr>
-            <w:r>
-              <w:rPr>
-                <w:rFonts w:ascii="Cambria" w:hAnsi="Cambria"/>
-                <w:sz w:val="20"/>
-                <w:szCs w:val="20"/>
-              </w:rPr>
-              <w:t>0.3744</w:t>
-            </w:r>
-          </w:p>
-        </w:tc>
-        <w:tc>
-          <w:tcPr>
-            <w:tcW w:w="508" w:type="pct"/>
-          </w:tcPr>
-          <w:p>
-            <w:pPr>
-              <w:jc w:val="center"/>
-              <w:rPr>
-                <w:rFonts w:ascii="Cambria" w:hAnsi="Cambria"/>
-                <w:sz w:val="20"/>
-                <w:szCs w:val="20"/>
-              </w:rPr>
-            </w:pPr>
-            <w:r>
-              <w:rPr>
-                <w:rFonts w:ascii="Cambria" w:hAnsi="Cambria"/>
-                <w:sz w:val="20"/>
-                <w:szCs w:val="20"/>
-              </w:rPr>
-              <w:t>-</w:t>
-            </w:r>
-          </w:p>
-        </w:tc>
-        <w:tc>
-          <w:tcPr>
-            <w:tcW w:w="521" w:type="pct"/>
-          </w:tcPr>
-          <w:p>
-            <w:pPr>
-              <w:jc w:val="center"/>
-              <w:rPr>
-                <w:rFonts w:ascii="Cambria" w:hAnsi="Cambria"/>
-                <w:sz w:val="20"/>
-                <w:szCs w:val="20"/>
-              </w:rPr>
-            </w:pPr>
-            <w:r>
-              <w:rPr>
-                <w:rFonts w:ascii="Cambria" w:hAnsi="Cambria"/>
-                <w:sz w:val="20"/>
-                <w:szCs w:val="20"/>
-              </w:rPr>
-              <w:t>-</w:t>
-            </w:r>
-          </w:p>
-        </w:tc>
-        <w:tc>
-          <w:tcPr>
-            <w:tcW w:w="507" w:type="pct"/>
           </w:tcPr>
           <w:p>
             <w:pPr>
@@ -7873,6 +7863,19 @@
             <w:vAlign w:val="center"/>
           </w:tcPr>
           <w:p>
+            <w:r>
+              <w:t>51.7</w:t>
+            </w:r>
+          </w:p>
+        </w:tc>
+      </w:tr>
+      <w:tr>
+        <w:tc>
+          <w:tcPr>
+            <w:tcW w:w="3005" w:type="dxa"/>
+            <w:vAlign w:val="center"/>
+          </w:tcPr>
+          <w:p>
             <w:pPr>
               <w:jc w:val="center"/>
               <w:rPr>
@@ -7880,6 +7883,52 @@
                 <w:noProof/>
               </w:rPr>
             </w:pPr>
+            <w:r>
+              <w:rPr>
+                <w:rFonts w:ascii="Cambria" w:hAnsi="Cambria" w:cs="Times New Roman"/>
+              </w:rPr>
+              <w:t>Grinding</w:t>
+            </w:r>
+          </w:p>
+        </w:tc>
+        <w:tc>
+          <w:tcPr>
+            <w:tcW w:w="3232" w:type="dxa"/>
+            <w:vAlign w:val="center"/>
+          </w:tcPr>
+          <w:p>
+            <w:pPr>
+              <w:jc w:val="center"/>
+              <w:rPr>
+                <w:rFonts w:ascii="Cambria" w:hAnsi="Cambria" w:cs="Times New Roman"/>
+                <w:noProof/>
+              </w:rPr>
+            </w:pPr>
+            <w:r>
+              <w:rPr>
+                <w:rFonts w:ascii="Cambria" w:hAnsi="Cambria" w:cs="Times New Roman"/>
+                <w:noProof/>
+              </w:rPr>
+              <w:t>1</w:t>
+            </w:r>
+            <w:r>
+              <w:rPr>
+                <w:rFonts w:ascii="Cambria" w:hAnsi="Cambria"/>
+                <w:noProof/>
+              </w:rPr>
+              <w:t>01</w:t>
+            </w:r>
+          </w:p>
+        </w:tc>
+        <w:tc>
+          <w:tcPr>
+            <w:tcW w:w="2779" w:type="dxa"/>
+            <w:vAlign w:val="center"/>
+          </w:tcPr>
+          <w:p>
+            <w:r>
+              <w:t>17.8</w:t>
+            </w:r>
           </w:p>
         </w:tc>
       </w:tr>
@@ -7901,7 +7950,7 @@
               <w:rPr>
                 <w:rFonts w:ascii="Cambria" w:hAnsi="Cambria" w:cs="Times New Roman"/>
               </w:rPr>
-              <w:t>Grinding</w:t>
+              <w:t>Soaking</w:t>
             </w:r>
           </w:p>
         </w:tc>
@@ -7923,14 +7972,14 @@
                 <w:rFonts w:ascii="Cambria" w:hAnsi="Cambria" w:cs="Times New Roman"/>
                 <w:noProof/>
               </w:rPr>
-              <w:t>1</w:t>
+              <w:t>6</w:t>
             </w:r>
             <w:r>
               <w:rPr>
                 <w:rFonts w:ascii="Cambria" w:hAnsi="Cambria"/>
                 <w:noProof/>
               </w:rPr>
-              <w:t>01</w:t>
+              <w:t>3</w:t>
             </w:r>
           </w:p>
         </w:tc>
@@ -7940,6 +7989,19 @@
             <w:vAlign w:val="center"/>
           </w:tcPr>
           <w:p>
+            <w:r>
+              <w:t>11.1</w:t>
+            </w:r>
+          </w:p>
+        </w:tc>
+      </w:tr>
+      <w:tr>
+        <w:tc>
+          <w:tcPr>
+            <w:tcW w:w="3005" w:type="dxa"/>
+            <w:vAlign w:val="center"/>
+          </w:tcPr>
+          <w:p>
             <w:pPr>
               <w:jc w:val="center"/>
               <w:rPr>
@@ -7947,6 +8009,52 @@
                 <w:noProof/>
               </w:rPr>
             </w:pPr>
+            <w:r>
+              <w:rPr>
+                <w:rFonts w:ascii="Cambria" w:hAnsi="Cambria" w:cs="Times New Roman"/>
+              </w:rPr>
+              <w:t>Coagulation</w:t>
+            </w:r>
+          </w:p>
+        </w:tc>
+        <w:tc>
+          <w:tcPr>
+            <w:tcW w:w="3232" w:type="dxa"/>
+            <w:vAlign w:val="center"/>
+          </w:tcPr>
+          <w:p>
+            <w:pPr>
+              <w:jc w:val="center"/>
+              <w:rPr>
+                <w:rFonts w:ascii="Cambria" w:hAnsi="Cambria" w:cs="Times New Roman"/>
+                <w:noProof/>
+              </w:rPr>
+            </w:pPr>
+            <w:r>
+              <w:rPr>
+                <w:rFonts w:ascii="Cambria" w:hAnsi="Cambria" w:cs="Times New Roman"/>
+                <w:noProof/>
+              </w:rPr>
+              <w:t>3</w:t>
+            </w:r>
+            <w:r>
+              <w:rPr>
+                <w:rFonts w:ascii="Cambria" w:hAnsi="Cambria"/>
+                <w:noProof/>
+              </w:rPr>
+              <w:t>8.2</w:t>
+            </w:r>
+          </w:p>
+        </w:tc>
+        <w:tc>
+          <w:tcPr>
+            <w:tcW w:w="2779" w:type="dxa"/>
+            <w:vAlign w:val="center"/>
+          </w:tcPr>
+          <w:p>
+            <w:r>
+              <w:t>6.7</w:t>
+            </w:r>
           </w:p>
         </w:tc>
       </w:tr>
@@ -7968,7 +8076,7 @@
               <w:rPr>
                 <w:rFonts w:ascii="Cambria" w:hAnsi="Cambria" w:cs="Times New Roman"/>
               </w:rPr>
-              <w:t>Soaking</w:t>
+              <w:t>Washing</w:t>
             </w:r>
           </w:p>
         </w:tc>
@@ -7997,7 +8105,7 @@
                 <w:rFonts w:ascii="Cambria" w:hAnsi="Cambria"/>
                 <w:noProof/>
               </w:rPr>
-              <w:t>3</w:t>
+              <w:t>5.3</w:t>
             </w:r>
           </w:p>
         </w:tc>
@@ -8007,147 +8115,9 @@
             <w:vAlign w:val="center"/>
           </w:tcPr>
           <w:p>
-            <w:pPr>
-              <w:jc w:val="center"/>
-              <w:rPr>
-                <w:rFonts w:ascii="Cambria" w:hAnsi="Cambria" w:cs="Times New Roman"/>
-                <w:noProof/>
-              </w:rPr>
-            </w:pPr>
-          </w:p>
-        </w:tc>
-      </w:tr>
-      <w:tr>
-        <w:tc>
-          <w:tcPr>
-            <w:tcW w:w="3005" w:type="dxa"/>
-            <w:vAlign w:val="center"/>
-          </w:tcPr>
-          <w:p>
-            <w:pPr>
-              <w:jc w:val="center"/>
-              <w:rPr>
-                <w:rFonts w:ascii="Cambria" w:hAnsi="Cambria" w:cs="Times New Roman"/>
-                <w:noProof/>
-              </w:rPr>
-            </w:pPr>
-            <w:r>
-              <w:rPr>
-                <w:rFonts w:ascii="Cambria" w:hAnsi="Cambria" w:cs="Times New Roman"/>
-              </w:rPr>
-              <w:t>Coagulation</w:t>
-            </w:r>
-          </w:p>
-        </w:tc>
-        <w:tc>
-          <w:tcPr>
-            <w:tcW w:w="3232" w:type="dxa"/>
-            <w:vAlign w:val="center"/>
-          </w:tcPr>
-          <w:p>
-            <w:pPr>
-              <w:jc w:val="center"/>
-              <w:rPr>
-                <w:rFonts w:ascii="Cambria" w:hAnsi="Cambria" w:cs="Times New Roman"/>
-                <w:noProof/>
-              </w:rPr>
-            </w:pPr>
-            <w:r>
-              <w:rPr>
-                <w:rFonts w:ascii="Cambria" w:hAnsi="Cambria" w:cs="Times New Roman"/>
-                <w:noProof/>
-              </w:rPr>
-              <w:t>3</w:t>
-            </w:r>
-            <w:r>
-              <w:rPr>
-                <w:rFonts w:ascii="Cambria" w:hAnsi="Cambria"/>
-                <w:noProof/>
-              </w:rPr>
-              <w:t>8.2</w:t>
-            </w:r>
-          </w:p>
-        </w:tc>
-        <w:tc>
-          <w:tcPr>
-            <w:tcW w:w="2779" w:type="dxa"/>
-            <w:vAlign w:val="center"/>
-          </w:tcPr>
-          <w:p>
-            <w:pPr>
-              <w:jc w:val="center"/>
-              <w:rPr>
-                <w:rFonts w:ascii="Cambria" w:hAnsi="Cambria" w:cs="Times New Roman"/>
-                <w:noProof/>
-              </w:rPr>
-            </w:pPr>
-          </w:p>
-        </w:tc>
-      </w:tr>
-      <w:tr>
-        <w:tc>
-          <w:tcPr>
-            <w:tcW w:w="3005" w:type="dxa"/>
-            <w:vAlign w:val="center"/>
-          </w:tcPr>
-          <w:p>
-            <w:pPr>
-              <w:jc w:val="center"/>
-              <w:rPr>
-                <w:rFonts w:ascii="Cambria" w:hAnsi="Cambria" w:cs="Times New Roman"/>
-                <w:noProof/>
-              </w:rPr>
-            </w:pPr>
-            <w:r>
-              <w:rPr>
-                <w:rFonts w:ascii="Cambria" w:hAnsi="Cambria" w:cs="Times New Roman"/>
-              </w:rPr>
-              <w:t>Washing</w:t>
-            </w:r>
-          </w:p>
-        </w:tc>
-        <w:tc>
-          <w:tcPr>
-            <w:tcW w:w="3232" w:type="dxa"/>
-            <w:vAlign w:val="center"/>
-          </w:tcPr>
-          <w:p>
-            <w:pPr>
-              <w:jc w:val="center"/>
-              <w:rPr>
-                <w:rFonts w:ascii="Cambria" w:hAnsi="Cambria" w:cs="Times New Roman"/>
-                <w:noProof/>
-              </w:rPr>
-            </w:pPr>
-            <w:r>
-              <w:rPr>
-                <w:rFonts w:ascii="Cambria" w:hAnsi="Cambria" w:cs="Times New Roman"/>
-                <w:noProof/>
-              </w:rPr>
-              <w:t>6</w:t>
-            </w:r>
-            <w:r>
-              <w:rPr>
-                <w:rFonts w:ascii="Cambria" w:hAnsi="Cambria"/>
-                <w:noProof/>
-              </w:rPr>
-              <w:t>5.3</w:t>
-            </w:r>
-          </w:p>
-        </w:tc>
-        <w:tc>
-          <w:tcPr>
-            <w:tcW w:w="2779" w:type="dxa"/>
-            <w:vAlign w:val="center"/>
-          </w:tcPr>
-          <w:p>
-            <w:pPr>
-              <w:jc w:val="center"/>
-              <w:rPr>
-                <w:rFonts w:ascii="Cambria" w:hAnsi="Cambria" w:cs="Times New Roman"/>
-                <w:noProof/>
-              </w:rPr>
-            </w:pPr>
+            <w:r>
+              <w:t>11.5</w:t>
+            </w:r>
           </w:p>
         </w:tc>
       </w:tr>
@@ -8216,13 +8186,9 @@
             <w:vAlign w:val="center"/>
           </w:tcPr>
           <w:p>
-            <w:pPr>
-              <w:jc w:val="center"/>
-              <w:rPr>
-                <w:rFonts w:ascii="Cambria" w:hAnsi="Cambria" w:cs="Times New Roman"/>
-                <w:noProof/>
-              </w:rPr>
-            </w:pPr>
+            <w:r>
+              <w:t>1.3</w:t>
+            </w:r>
           </w:p>
         </w:tc>
       </w:tr>

</xml_diff>